<commit_message>
Restyle forms and update report screenshots and formatting
</commit_message>
<xml_diff>
--- a/Assignment4_ArdakKazykhan.docx
+++ b/Assignment4_ArdakKazykhan.docx
@@ -14,10 +14,10 @@
       </w:pPr>
       <w:r>
         <w:rPr>
-          <w:rFonts w:ascii="Arial" w:hAnsi="Arial"/>
+          <w:rFonts w:ascii="Calibri" w:hAnsi="Calibri"/>
           <w:b/>
           <w:color w:val="000000"/>
-          <w:sz w:val="24"/>
+          <w:sz w:val="36"/>
         </w:rPr>
         <w:t>Assignment 4</w:t>
       </w:r>
@@ -33,10 +33,10 @@
       </w:pPr>
       <w:r>
         <w:rPr>
-          <w:rFonts w:ascii="Arial" w:hAnsi="Arial"/>
+          <w:rFonts w:ascii="Calibri" w:hAnsi="Calibri"/>
           <w:b/>
-          <w:color w:val="000000"/>
-          <w:sz w:val="24"/>
+          <w:color w:val="20334D"/>
+          <w:sz w:val="26"/>
         </w:rPr>
         <w:t>Ardak Kazykhan, IT-2510</w:t>
       </w:r>
@@ -52,10 +52,10 @@
       </w:pPr>
       <w:r>
         <w:rPr>
-          <w:rFonts w:ascii="Arial" w:hAnsi="Arial"/>
+          <w:rFonts w:ascii="Calibri" w:hAnsi="Calibri"/>
           <w:b/>
-          <w:color w:val="000000"/>
-          <w:sz w:val="24"/>
+          <w:color w:val="20334D"/>
+          <w:sz w:val="26"/>
         </w:rPr>
         <w:t>Forms and Validation with HTML and Bootstrap</w:t>
       </w:r>
@@ -68,7 +68,7 @@
       </w:pPr>
       <w:r>
         <w:rPr>
-          <w:rFonts w:ascii="Arial" w:hAnsi="Arial"/>
+          <w:rFonts w:ascii="Calibri" w:hAnsi="Calibri"/>
           <w:b w:val="0"/>
           <w:color w:val="000000"/>
           <w:sz w:val="24"/>
@@ -87,10 +87,10 @@
       </w:pPr>
       <w:r>
         <w:rPr>
-          <w:rFonts w:ascii="Arial" w:hAnsi="Arial"/>
+          <w:rFonts w:ascii="Calibri" w:hAnsi="Calibri"/>
           <w:b/>
-          <w:color w:val="000000"/>
-          <w:sz w:val="24"/>
+          <w:color w:val="20334D"/>
+          <w:sz w:val="26"/>
         </w:rPr>
         <w:t>GitHub repository</w:t>
       </w:r>
@@ -103,7 +103,7 @@
       </w:pPr>
       <w:r>
         <w:rPr>
-          <w:rFonts w:ascii="Arial" w:hAnsi="Arial"/>
+          <w:rFonts w:ascii="Calibri" w:hAnsi="Calibri"/>
           <w:b w:val="0"/>
           <w:color w:val="000000"/>
           <w:sz w:val="24"/>
@@ -122,10 +122,10 @@
       </w:pPr>
       <w:r>
         <w:rPr>
-          <w:rFonts w:ascii="Arial" w:hAnsi="Arial"/>
+          <w:rFonts w:ascii="Calibri" w:hAnsi="Calibri"/>
           <w:b/>
-          <w:color w:val="000000"/>
-          <w:sz w:val="24"/>
+          <w:color w:val="20334D"/>
+          <w:sz w:val="26"/>
         </w:rPr>
         <w:t>Task 1  Train ticket form at 1280px</w:t>
       </w:r>
@@ -178,7 +178,7 @@
       </w:pPr>
       <w:r>
         <w:rPr>
-          <w:rFonts w:ascii="Arial" w:hAnsi="Arial"/>
+          <w:rFonts w:ascii="Calibri" w:hAnsi="Calibri"/>
           <w:b w:val="0"/>
           <w:color w:val="000000"/>
           <w:sz w:val="20"/>
@@ -194,12 +194,12 @@
       </w:pPr>
       <w:r>
         <w:rPr>
-          <w:rFonts w:ascii="Arial" w:hAnsi="Arial"/>
+          <w:rFonts w:ascii="Calibri" w:hAnsi="Calibri"/>
           <w:b w:val="0"/>
           <w:color w:val="000000"/>
           <w:sz w:val="24"/>
         </w:rPr>
-        <w:t>I used floating labels for the cities, date inputs, a passenger select, carriage radios, a phone input group and an SMS switch. Custom CSS adds Montserrat, the given colours, rounded corners and a shadow.</w:t>
+        <w:t>I used floating labels, date inputs, a passenger select, carriage radios, a phone input group and an SMS switch. The updated design uses Montserrat, a white heading, compact corners and a subtle shadow. The ticket keeps the given green and gold colours.</w:t>
       </w:r>
     </w:p>
     <w:p>
@@ -210,7 +210,7 @@
       </w:pPr>
       <w:r>
         <w:rPr>
-          <w:rFonts w:ascii="Arial" w:hAnsi="Arial"/>
+          <w:rFonts w:ascii="Calibri" w:hAnsi="Calibri"/>
           <w:b w:val="0"/>
           <w:color w:val="000000"/>
           <w:sz w:val="24"/>
@@ -230,10 +230,10 @@
       </w:pPr>
       <w:r>
         <w:rPr>
-          <w:rFonts w:ascii="Arial" w:hAnsi="Arial"/>
+          <w:rFonts w:ascii="Calibri" w:hAnsi="Calibri"/>
           <w:b/>
-          <w:color w:val="000000"/>
-          <w:sz w:val="24"/>
+          <w:color w:val="20334D"/>
+          <w:sz w:val="26"/>
         </w:rPr>
         <w:t>Task 1  Train ticket form at 375px</w:t>
       </w:r>
@@ -286,7 +286,7 @@
       </w:pPr>
       <w:r>
         <w:rPr>
-          <w:rFonts w:ascii="Arial" w:hAnsi="Arial"/>
+          <w:rFonts w:ascii="Calibri" w:hAnsi="Calibri"/>
           <w:b w:val="0"/>
           <w:color w:val="000000"/>
           <w:sz w:val="20"/>
@@ -302,7 +302,7 @@
       </w:pPr>
       <w:r>
         <w:rPr>
-          <w:rFonts w:ascii="Arial" w:hAnsi="Arial"/>
+          <w:rFonts w:ascii="Calibri" w:hAnsi="Calibri"/>
           <w:b w:val="0"/>
           <w:color w:val="000000"/>
           <w:sz w:val="24"/>
@@ -312,7 +312,7 @@
     </w:p>
     <w:p>
       <w:pPr>
-        <w:shd w:val="clear" w:color="auto" w:fill="121314"/>
+        <w:shd w:val="clear" w:color="auto" w:fill="EDF3FB"/>
         <w:spacing w:after="0" w:line="285" w:lineRule="atLeast"/>
         <w:rPr>
           <w:rFonts w:ascii="Consolas" w:eastAsia="Times New Roman" w:hAnsi="Consolas" w:cs="Times New Roman"/>
@@ -328,7 +328,7 @@
         <w:rPr>
           <w:rFonts w:ascii="Consolas" w:hAnsi="Consolas"/>
           <w:b w:val="0"/>
-          <w:color w:val="D4D4D4"/>
+          <w:color w:val="20334D"/>
           <w:sz w:val="21"/>
         </w:rPr>
         <w:t>.actions { flex-direction: column-reverse; }</w:t>
@@ -336,7 +336,7 @@
     </w:p>
     <w:p>
       <w:pPr>
-        <w:shd w:val="clear" w:color="auto" w:fill="121314"/>
+        <w:shd w:val="clear" w:color="auto" w:fill="EDF3FB"/>
         <w:spacing w:after="0" w:line="285" w:lineRule="atLeast"/>
         <w:rPr>
           <w:rFonts w:ascii="Consolas" w:eastAsia="Times New Roman" w:hAnsi="Consolas" w:cs="Times New Roman"/>
@@ -352,7 +352,7 @@
         <w:rPr>
           <w:rFonts w:ascii="Consolas" w:hAnsi="Consolas"/>
           <w:b w:val="0"/>
-          <w:color w:val="D4D4D4"/>
+          <w:color w:val="20334D"/>
           <w:sz w:val="21"/>
         </w:rPr>
         <w:t>@media (min-width: 768px) {</w:t>
@@ -360,7 +360,7 @@
     </w:p>
     <w:p>
       <w:pPr>
-        <w:shd w:val="clear" w:color="auto" w:fill="121314"/>
+        <w:shd w:val="clear" w:color="auto" w:fill="EDF3FB"/>
         <w:spacing w:after="0" w:line="285" w:lineRule="atLeast"/>
         <w:rPr>
           <w:rFonts w:ascii="Consolas" w:eastAsia="Times New Roman" w:hAnsi="Consolas" w:cs="Times New Roman"/>
@@ -376,7 +376,7 @@
         <w:rPr>
           <w:rFonts w:ascii="Consolas" w:hAnsi="Consolas"/>
           <w:b w:val="0"/>
-          <w:color w:val="D4D4D4"/>
+          <w:color w:val="20334D"/>
           <w:sz w:val="21"/>
         </w:rPr>
         <w:t xml:space="preserve">  .actions { flex-direction: row; }</w:t>
@@ -384,7 +384,7 @@
     </w:p>
     <w:p>
       <w:pPr>
-        <w:shd w:val="clear" w:color="auto" w:fill="121314"/>
+        <w:shd w:val="clear" w:color="auto" w:fill="EDF3FB"/>
         <w:spacing w:after="0" w:line="285" w:lineRule="atLeast"/>
         <w:rPr>
           <w:rFonts w:ascii="Consolas" w:eastAsia="Times New Roman" w:hAnsi="Consolas" w:cs="Times New Roman"/>
@@ -400,7 +400,7 @@
         <w:rPr>
           <w:rFonts w:ascii="Consolas" w:hAnsi="Consolas"/>
           <w:b w:val="0"/>
-          <w:color w:val="D4D4D4"/>
+          <w:color w:val="20334D"/>
           <w:sz w:val="21"/>
         </w:rPr>
         <w:t>}</w:t>
@@ -414,7 +414,7 @@
       </w:pPr>
       <w:r>
         <w:rPr>
-          <w:rFonts w:ascii="Arial" w:hAnsi="Arial"/>
+          <w:rFonts w:ascii="Calibri" w:hAnsi="Calibri"/>
           <w:b w:val="0"/>
           <w:color w:val="000000"/>
           <w:sz w:val="24"/>
@@ -433,10 +433,10 @@
       </w:pPr>
       <w:r>
         <w:rPr>
-          <w:rFonts w:ascii="Arial" w:hAnsi="Arial"/>
+          <w:rFonts w:ascii="Calibri" w:hAnsi="Calibri"/>
           <w:b/>
-          <w:color w:val="000000"/>
-          <w:sz w:val="24"/>
+          <w:color w:val="20334D"/>
+          <w:sz w:val="26"/>
         </w:rPr>
         <w:t>Task 2  Hackathon registration</w:t>
       </w:r>
@@ -449,12 +449,12 @@
       </w:pPr>
       <w:r>
         <w:rPr>
-          <w:rFonts w:ascii="Arial" w:hAnsi="Arial"/>
+          <w:rFonts w:ascii="Calibri" w:hAnsi="Calibri"/>
           <w:b w:val="0"/>
           <w:color w:val="000000"/>
           <w:sz w:val="24"/>
         </w:rPr>
-        <w:t>Each rule is written with type, required, min, max, step, minlength or maxlength. No pattern attribute is used. The optional GitHub field accepts an empty value or a full URL.</w:t>
+        <w:t>The registration uses blue accents and light grey fields. Each rule uses type, required, min, max, step, minlength or maxlength. No pattern is used. The optional GitHub field accepts an empty value or a full URL.</w:t>
       </w:r>
     </w:p>
     <w:p>
@@ -505,7 +505,7 @@
       </w:pPr>
       <w:r>
         <w:rPr>
-          <w:rFonts w:ascii="Arial" w:hAnsi="Arial"/>
+          <w:rFonts w:ascii="Calibri" w:hAnsi="Calibri"/>
           <w:b w:val="0"/>
           <w:color w:val="000000"/>
           <w:sz w:val="20"/>
@@ -521,7 +521,7 @@
       </w:pPr>
       <w:r>
         <w:rPr>
-          <w:rFonts w:ascii="Arial" w:hAnsi="Arial"/>
+          <w:rFonts w:ascii="Calibri" w:hAnsi="Calibri"/>
           <w:b w:val="0"/>
           <w:color w:val="000000"/>
           <w:sz w:val="24"/>
@@ -541,10 +541,10 @@
       </w:pPr>
       <w:r>
         <w:rPr>
-          <w:rFonts w:ascii="Arial" w:hAnsi="Arial"/>
+          <w:rFonts w:ascii="Calibri" w:hAnsi="Calibri"/>
           <w:b/>
-          <w:color w:val="000000"/>
-          <w:sz w:val="24"/>
+          <w:color w:val="20334D"/>
+          <w:sz w:val="26"/>
         </w:rPr>
         <w:t>Task 2  Validation results</w:t>
       </w:r>
@@ -557,7 +557,7 @@
       </w:pPr>
       <w:r>
         <w:rPr>
-          <w:rFonts w:ascii="Arial" w:hAnsi="Arial"/>
+          <w:rFonts w:ascii="Calibri" w:hAnsi="Calibri"/>
           <w:b w:val="0"/>
           <w:color w:val="000000"/>
           <w:sz w:val="24"/>
@@ -599,15 +599,15 @@
               <w:bottom w:w="80" w:type="dxa"/>
               <w:right w:w="80" w:type="dxa"/>
             </w:tcMar>
-            <w:shd w:fill="EEEEEE"/>
-          </w:tcPr>
-          <w:p>
-            <w:pPr>
-              <w:spacing w:after="40" w:line="252" w:lineRule="auto"/>
-            </w:pPr>
-            <w:r>
-              <w:rPr>
-                <w:rFonts w:ascii="Arial" w:hAnsi="Arial"/>
+            <w:shd w:fill="DCE8F8"/>
+          </w:tcPr>
+          <w:p>
+            <w:pPr>
+              <w:spacing w:after="40" w:line="252" w:lineRule="auto"/>
+            </w:pPr>
+            <w:r>
+              <w:rPr>
+                <w:rFonts w:ascii="Calibri" w:hAnsi="Calibri"/>
                 <w:b/>
                 <w:sz w:val="20"/>
               </w:rPr>
@@ -631,15 +631,15 @@
               <w:bottom w:w="80" w:type="dxa"/>
               <w:right w:w="80" w:type="dxa"/>
             </w:tcMar>
-            <w:shd w:fill="EEEEEE"/>
-          </w:tcPr>
-          <w:p>
-            <w:pPr>
-              <w:spacing w:after="40" w:line="252" w:lineRule="auto"/>
-            </w:pPr>
-            <w:r>
-              <w:rPr>
-                <w:rFonts w:ascii="Arial" w:hAnsi="Arial"/>
+            <w:shd w:fill="DCE8F8"/>
+          </w:tcPr>
+          <w:p>
+            <w:pPr>
+              <w:spacing w:after="40" w:line="252" w:lineRule="auto"/>
+            </w:pPr>
+            <w:r>
+              <w:rPr>
+                <w:rFonts w:ascii="Calibri" w:hAnsi="Calibri"/>
                 <w:b/>
                 <w:sz w:val="20"/>
               </w:rPr>
@@ -663,15 +663,15 @@
               <w:bottom w:w="80" w:type="dxa"/>
               <w:right w:w="80" w:type="dxa"/>
             </w:tcMar>
-            <w:shd w:fill="EEEEEE"/>
-          </w:tcPr>
-          <w:p>
-            <w:pPr>
-              <w:spacing w:after="40" w:line="252" w:lineRule="auto"/>
-            </w:pPr>
-            <w:r>
-              <w:rPr>
-                <w:rFonts w:ascii="Arial" w:hAnsi="Arial"/>
+            <w:shd w:fill="DCE8F8"/>
+          </w:tcPr>
+          <w:p>
+            <w:pPr>
+              <w:spacing w:after="40" w:line="252" w:lineRule="auto"/>
+            </w:pPr>
+            <w:r>
+              <w:rPr>
+                <w:rFonts w:ascii="Calibri" w:hAnsi="Calibri"/>
                 <w:b/>
                 <w:sz w:val="20"/>
               </w:rPr>
@@ -695,15 +695,15 @@
               <w:bottom w:w="80" w:type="dxa"/>
               <w:right w:w="80" w:type="dxa"/>
             </w:tcMar>
-            <w:shd w:fill="EEEEEE"/>
-          </w:tcPr>
-          <w:p>
-            <w:pPr>
-              <w:spacing w:after="40" w:line="252" w:lineRule="auto"/>
-            </w:pPr>
-            <w:r>
-              <w:rPr>
-                <w:rFonts w:ascii="Arial" w:hAnsi="Arial"/>
+            <w:shd w:fill="DCE8F8"/>
+          </w:tcPr>
+          <w:p>
+            <w:pPr>
+              <w:spacing w:after="40" w:line="252" w:lineRule="auto"/>
+            </w:pPr>
+            <w:r>
+              <w:rPr>
+                <w:rFonts w:ascii="Calibri" w:hAnsi="Calibri"/>
                 <w:b/>
                 <w:sz w:val="20"/>
               </w:rPr>
@@ -739,7 +739,7 @@
             </w:pPr>
             <w:r>
               <w:rPr>
-                <w:rFonts w:ascii="Arial" w:hAnsi="Arial"/>
+                <w:rFonts w:ascii="Calibri" w:hAnsi="Calibri"/>
                 <w:b w:val="0"/>
                 <w:sz w:val="20"/>
               </w:rPr>
@@ -770,7 +770,7 @@
             </w:pPr>
             <w:r>
               <w:rPr>
-                <w:rFonts w:ascii="Arial" w:hAnsi="Arial"/>
+                <w:rFonts w:ascii="Calibri" w:hAnsi="Calibri"/>
                 <w:b w:val="0"/>
                 <w:sz w:val="20"/>
               </w:rPr>
@@ -801,7 +801,7 @@
             </w:pPr>
             <w:r>
               <w:rPr>
-                <w:rFonts w:ascii="Arial" w:hAnsi="Arial"/>
+                <w:rFonts w:ascii="Calibri" w:hAnsi="Calibri"/>
                 <w:b w:val="0"/>
                 <w:sz w:val="20"/>
               </w:rPr>
@@ -832,7 +832,7 @@
             </w:pPr>
             <w:r>
               <w:rPr>
-                <w:rFonts w:ascii="Arial" w:hAnsi="Arial"/>
+                <w:rFonts w:ascii="Calibri" w:hAnsi="Calibri"/>
                 <w:b w:val="0"/>
                 <w:sz w:val="20"/>
               </w:rPr>
@@ -861,14 +861,15 @@
               <w:bottom w:w="80" w:type="dxa"/>
               <w:right w:w="80" w:type="dxa"/>
             </w:tcMar>
-          </w:tcPr>
-          <w:p>
-            <w:pPr>
-              <w:spacing w:after="40" w:line="252" w:lineRule="auto"/>
-            </w:pPr>
-            <w:r>
-              <w:rPr>
-                <w:rFonts w:ascii="Arial" w:hAnsi="Arial"/>
+            <w:shd w:fill="F5F8FC"/>
+          </w:tcPr>
+          <w:p>
+            <w:pPr>
+              <w:spacing w:after="40" w:line="252" w:lineRule="auto"/>
+            </w:pPr>
+            <w:r>
+              <w:rPr>
+                <w:rFonts w:ascii="Calibri" w:hAnsi="Calibri"/>
                 <w:b w:val="0"/>
                 <w:sz w:val="20"/>
               </w:rPr>
@@ -892,14 +893,15 @@
               <w:bottom w:w="80" w:type="dxa"/>
               <w:right w:w="80" w:type="dxa"/>
             </w:tcMar>
-          </w:tcPr>
-          <w:p>
-            <w:pPr>
-              <w:spacing w:after="40" w:line="252" w:lineRule="auto"/>
-            </w:pPr>
-            <w:r>
-              <w:rPr>
-                <w:rFonts w:ascii="Arial" w:hAnsi="Arial"/>
+            <w:shd w:fill="F5F8FC"/>
+          </w:tcPr>
+          <w:p>
+            <w:pPr>
+              <w:spacing w:after="40" w:line="252" w:lineRule="auto"/>
+            </w:pPr>
+            <w:r>
+              <w:rPr>
+                <w:rFonts w:ascii="Calibri" w:hAnsi="Calibri"/>
                 <w:b w:val="0"/>
                 <w:sz w:val="20"/>
               </w:rPr>
@@ -925,14 +927,15 @@
               <w:bottom w:w="80" w:type="dxa"/>
               <w:right w:w="80" w:type="dxa"/>
             </w:tcMar>
-          </w:tcPr>
-          <w:p>
-            <w:pPr>
-              <w:spacing w:after="40" w:line="252" w:lineRule="auto"/>
-            </w:pPr>
-            <w:r>
-              <w:rPr>
-                <w:rFonts w:ascii="Arial" w:hAnsi="Arial"/>
+            <w:shd w:fill="F5F8FC"/>
+          </w:tcPr>
+          <w:p>
+            <w:pPr>
+              <w:spacing w:after="40" w:line="252" w:lineRule="auto"/>
+            </w:pPr>
+            <w:r>
+              <w:rPr>
+                <w:rFonts w:ascii="Calibri" w:hAnsi="Calibri"/>
                 <w:b w:val="0"/>
                 <w:sz w:val="20"/>
               </w:rPr>
@@ -958,14 +961,15 @@
               <w:bottom w:w="80" w:type="dxa"/>
               <w:right w:w="80" w:type="dxa"/>
             </w:tcMar>
-          </w:tcPr>
-          <w:p>
-            <w:pPr>
-              <w:spacing w:after="40" w:line="252" w:lineRule="auto"/>
-            </w:pPr>
-            <w:r>
-              <w:rPr>
-                <w:rFonts w:ascii="Arial" w:hAnsi="Arial"/>
+            <w:shd w:fill="F5F8FC"/>
+          </w:tcPr>
+          <w:p>
+            <w:pPr>
+              <w:spacing w:after="40" w:line="252" w:lineRule="auto"/>
+            </w:pPr>
+            <w:r>
+              <w:rPr>
+                <w:rFonts w:ascii="Calibri" w:hAnsi="Calibri"/>
                 <w:b w:val="0"/>
                 <w:sz w:val="20"/>
               </w:rPr>
@@ -1001,7 +1005,7 @@
             </w:pPr>
             <w:r>
               <w:rPr>
-                <w:rFonts w:ascii="Arial" w:hAnsi="Arial"/>
+                <w:rFonts w:ascii="Calibri" w:hAnsi="Calibri"/>
                 <w:b w:val="0"/>
                 <w:sz w:val="20"/>
               </w:rPr>
@@ -1032,7 +1036,7 @@
             </w:pPr>
             <w:r>
               <w:rPr>
-                <w:rFonts w:ascii="Arial" w:hAnsi="Arial"/>
+                <w:rFonts w:ascii="Calibri" w:hAnsi="Calibri"/>
                 <w:b w:val="0"/>
                 <w:sz w:val="20"/>
               </w:rPr>
@@ -1063,7 +1067,7 @@
             </w:pPr>
             <w:r>
               <w:rPr>
-                <w:rFonts w:ascii="Arial" w:hAnsi="Arial"/>
+                <w:rFonts w:ascii="Calibri" w:hAnsi="Calibri"/>
                 <w:b w:val="0"/>
                 <w:sz w:val="20"/>
               </w:rPr>
@@ -1094,7 +1098,7 @@
             </w:pPr>
             <w:r>
               <w:rPr>
-                <w:rFonts w:ascii="Arial" w:hAnsi="Arial"/>
+                <w:rFonts w:ascii="Calibri" w:hAnsi="Calibri"/>
                 <w:b w:val="0"/>
                 <w:sz w:val="20"/>
               </w:rPr>
@@ -1123,14 +1127,15 @@
               <w:bottom w:w="80" w:type="dxa"/>
               <w:right w:w="80" w:type="dxa"/>
             </w:tcMar>
-          </w:tcPr>
-          <w:p>
-            <w:pPr>
-              <w:spacing w:after="40" w:line="252" w:lineRule="auto"/>
-            </w:pPr>
-            <w:r>
-              <w:rPr>
-                <w:rFonts w:ascii="Arial" w:hAnsi="Arial"/>
+            <w:shd w:fill="F5F8FC"/>
+          </w:tcPr>
+          <w:p>
+            <w:pPr>
+              <w:spacing w:after="40" w:line="252" w:lineRule="auto"/>
+            </w:pPr>
+            <w:r>
+              <w:rPr>
+                <w:rFonts w:ascii="Calibri" w:hAnsi="Calibri"/>
                 <w:b w:val="0"/>
                 <w:sz w:val="20"/>
               </w:rPr>
@@ -1154,14 +1159,15 @@
               <w:bottom w:w="80" w:type="dxa"/>
               <w:right w:w="80" w:type="dxa"/>
             </w:tcMar>
-          </w:tcPr>
-          <w:p>
-            <w:pPr>
-              <w:spacing w:after="40" w:line="252" w:lineRule="auto"/>
-            </w:pPr>
-            <w:r>
-              <w:rPr>
-                <w:rFonts w:ascii="Arial" w:hAnsi="Arial"/>
+            <w:shd w:fill="F5F8FC"/>
+          </w:tcPr>
+          <w:p>
+            <w:pPr>
+              <w:spacing w:after="40" w:line="252" w:lineRule="auto"/>
+            </w:pPr>
+            <w:r>
+              <w:rPr>
+                <w:rFonts w:ascii="Calibri" w:hAnsi="Calibri"/>
                 <w:b w:val="0"/>
                 <w:sz w:val="20"/>
               </w:rPr>
@@ -1185,14 +1191,15 @@
               <w:bottom w:w="80" w:type="dxa"/>
               <w:right w:w="80" w:type="dxa"/>
             </w:tcMar>
-          </w:tcPr>
-          <w:p>
-            <w:pPr>
-              <w:spacing w:after="40" w:line="252" w:lineRule="auto"/>
-            </w:pPr>
-            <w:r>
-              <w:rPr>
-                <w:rFonts w:ascii="Arial" w:hAnsi="Arial"/>
+            <w:shd w:fill="F5F8FC"/>
+          </w:tcPr>
+          <w:p>
+            <w:pPr>
+              <w:spacing w:after="40" w:line="252" w:lineRule="auto"/>
+            </w:pPr>
+            <w:r>
+              <w:rPr>
+                <w:rFonts w:ascii="Calibri" w:hAnsi="Calibri"/>
                 <w:b w:val="0"/>
                 <w:sz w:val="20"/>
               </w:rPr>
@@ -1216,14 +1223,15 @@
               <w:bottom w:w="80" w:type="dxa"/>
               <w:right w:w="80" w:type="dxa"/>
             </w:tcMar>
-          </w:tcPr>
-          <w:p>
-            <w:pPr>
-              <w:spacing w:after="40" w:line="252" w:lineRule="auto"/>
-            </w:pPr>
-            <w:r>
-              <w:rPr>
-                <w:rFonts w:ascii="Arial" w:hAnsi="Arial"/>
+            <w:shd w:fill="F5F8FC"/>
+          </w:tcPr>
+          <w:p>
+            <w:pPr>
+              <w:spacing w:after="40" w:line="252" w:lineRule="auto"/>
+            </w:pPr>
+            <w:r>
+              <w:rPr>
+                <w:rFonts w:ascii="Calibri" w:hAnsi="Calibri"/>
                 <w:b w:val="0"/>
                 <w:sz w:val="20"/>
               </w:rPr>
@@ -1259,7 +1267,7 @@
             </w:pPr>
             <w:r>
               <w:rPr>
-                <w:rFonts w:ascii="Arial" w:hAnsi="Arial"/>
+                <w:rFonts w:ascii="Calibri" w:hAnsi="Calibri"/>
                 <w:b w:val="0"/>
                 <w:sz w:val="20"/>
               </w:rPr>
@@ -1290,7 +1298,7 @@
             </w:pPr>
             <w:r>
               <w:rPr>
-                <w:rFonts w:ascii="Arial" w:hAnsi="Arial"/>
+                <w:rFonts w:ascii="Calibri" w:hAnsi="Calibri"/>
                 <w:b w:val="0"/>
                 <w:sz w:val="20"/>
               </w:rPr>
@@ -1321,7 +1329,7 @@
             </w:pPr>
             <w:r>
               <w:rPr>
-                <w:rFonts w:ascii="Arial" w:hAnsi="Arial"/>
+                <w:rFonts w:ascii="Calibri" w:hAnsi="Calibri"/>
                 <w:b w:val="0"/>
                 <w:sz w:val="20"/>
               </w:rPr>
@@ -1352,7 +1360,7 @@
             </w:pPr>
             <w:r>
               <w:rPr>
-                <w:rFonts w:ascii="Arial" w:hAnsi="Arial"/>
+                <w:rFonts w:ascii="Calibri" w:hAnsi="Calibri"/>
                 <w:b w:val="0"/>
                 <w:sz w:val="20"/>
               </w:rPr>
@@ -1381,14 +1389,15 @@
               <w:bottom w:w="80" w:type="dxa"/>
               <w:right w:w="80" w:type="dxa"/>
             </w:tcMar>
-          </w:tcPr>
-          <w:p>
-            <w:pPr>
-              <w:spacing w:after="40" w:line="252" w:lineRule="auto"/>
-            </w:pPr>
-            <w:r>
-              <w:rPr>
-                <w:rFonts w:ascii="Arial" w:hAnsi="Arial"/>
+            <w:shd w:fill="F5F8FC"/>
+          </w:tcPr>
+          <w:p>
+            <w:pPr>
+              <w:spacing w:after="40" w:line="252" w:lineRule="auto"/>
+            </w:pPr>
+            <w:r>
+              <w:rPr>
+                <w:rFonts w:ascii="Calibri" w:hAnsi="Calibri"/>
                 <w:b w:val="0"/>
                 <w:sz w:val="20"/>
               </w:rPr>
@@ -1412,14 +1421,15 @@
               <w:bottom w:w="80" w:type="dxa"/>
               <w:right w:w="80" w:type="dxa"/>
             </w:tcMar>
-          </w:tcPr>
-          <w:p>
-            <w:pPr>
-              <w:spacing w:after="40" w:line="252" w:lineRule="auto"/>
-            </w:pPr>
-            <w:r>
-              <w:rPr>
-                <w:rFonts w:ascii="Arial" w:hAnsi="Arial"/>
+            <w:shd w:fill="F5F8FC"/>
+          </w:tcPr>
+          <w:p>
+            <w:pPr>
+              <w:spacing w:after="40" w:line="252" w:lineRule="auto"/>
+            </w:pPr>
+            <w:r>
+              <w:rPr>
+                <w:rFonts w:ascii="Calibri" w:hAnsi="Calibri"/>
                 <w:b w:val="0"/>
                 <w:sz w:val="20"/>
               </w:rPr>
@@ -1443,14 +1453,15 @@
               <w:bottom w:w="80" w:type="dxa"/>
               <w:right w:w="80" w:type="dxa"/>
             </w:tcMar>
-          </w:tcPr>
-          <w:p>
-            <w:pPr>
-              <w:spacing w:after="40" w:line="252" w:lineRule="auto"/>
-            </w:pPr>
-            <w:r>
-              <w:rPr>
-                <w:rFonts w:ascii="Arial" w:hAnsi="Arial"/>
+            <w:shd w:fill="F5F8FC"/>
+          </w:tcPr>
+          <w:p>
+            <w:pPr>
+              <w:spacing w:after="40" w:line="252" w:lineRule="auto"/>
+            </w:pPr>
+            <w:r>
+              <w:rPr>
+                <w:rFonts w:ascii="Calibri" w:hAnsi="Calibri"/>
                 <w:b w:val="0"/>
                 <w:sz w:val="20"/>
               </w:rPr>
@@ -1474,14 +1485,15 @@
               <w:bottom w:w="80" w:type="dxa"/>
               <w:right w:w="80" w:type="dxa"/>
             </w:tcMar>
-          </w:tcPr>
-          <w:p>
-            <w:pPr>
-              <w:spacing w:after="40" w:line="252" w:lineRule="auto"/>
-            </w:pPr>
-            <w:r>
-              <w:rPr>
-                <w:rFonts w:ascii="Arial" w:hAnsi="Arial"/>
+            <w:shd w:fill="F5F8FC"/>
+          </w:tcPr>
+          <w:p>
+            <w:pPr>
+              <w:spacing w:after="40" w:line="252" w:lineRule="auto"/>
+            </w:pPr>
+            <w:r>
+              <w:rPr>
+                <w:rFonts w:ascii="Calibri" w:hAnsi="Calibri"/>
                 <w:b w:val="0"/>
                 <w:sz w:val="20"/>
               </w:rPr>
@@ -1517,7 +1529,7 @@
             </w:pPr>
             <w:r>
               <w:rPr>
-                <w:rFonts w:ascii="Arial" w:hAnsi="Arial"/>
+                <w:rFonts w:ascii="Calibri" w:hAnsi="Calibri"/>
                 <w:b w:val="0"/>
                 <w:sz w:val="20"/>
               </w:rPr>
@@ -1548,7 +1560,7 @@
             </w:pPr>
             <w:r>
               <w:rPr>
-                <w:rFonts w:ascii="Arial" w:hAnsi="Arial"/>
+                <w:rFonts w:ascii="Calibri" w:hAnsi="Calibri"/>
                 <w:b w:val="0"/>
                 <w:sz w:val="20"/>
               </w:rPr>
@@ -1579,7 +1591,7 @@
             </w:pPr>
             <w:r>
               <w:rPr>
-                <w:rFonts w:ascii="Arial" w:hAnsi="Arial"/>
+                <w:rFonts w:ascii="Calibri" w:hAnsi="Calibri"/>
                 <w:b w:val="0"/>
                 <w:sz w:val="20"/>
               </w:rPr>
@@ -1610,7 +1622,7 @@
             </w:pPr>
             <w:r>
               <w:rPr>
-                <w:rFonts w:ascii="Arial" w:hAnsi="Arial"/>
+                <w:rFonts w:ascii="Calibri" w:hAnsi="Calibri"/>
                 <w:b w:val="0"/>
                 <w:sz w:val="20"/>
               </w:rPr>
@@ -1639,14 +1651,15 @@
               <w:bottom w:w="80" w:type="dxa"/>
               <w:right w:w="80" w:type="dxa"/>
             </w:tcMar>
-          </w:tcPr>
-          <w:p>
-            <w:pPr>
-              <w:spacing w:after="40" w:line="252" w:lineRule="auto"/>
-            </w:pPr>
-            <w:r>
-              <w:rPr>
-                <w:rFonts w:ascii="Arial" w:hAnsi="Arial"/>
+            <w:shd w:fill="F5F8FC"/>
+          </w:tcPr>
+          <w:p>
+            <w:pPr>
+              <w:spacing w:after="40" w:line="252" w:lineRule="auto"/>
+            </w:pPr>
+            <w:r>
+              <w:rPr>
+                <w:rFonts w:ascii="Calibri" w:hAnsi="Calibri"/>
                 <w:b w:val="0"/>
                 <w:sz w:val="20"/>
               </w:rPr>
@@ -1670,14 +1683,15 @@
               <w:bottom w:w="80" w:type="dxa"/>
               <w:right w:w="80" w:type="dxa"/>
             </w:tcMar>
-          </w:tcPr>
-          <w:p>
-            <w:pPr>
-              <w:spacing w:after="40" w:line="252" w:lineRule="auto"/>
-            </w:pPr>
-            <w:r>
-              <w:rPr>
-                <w:rFonts w:ascii="Arial" w:hAnsi="Arial"/>
+            <w:shd w:fill="F5F8FC"/>
+          </w:tcPr>
+          <w:p>
+            <w:pPr>
+              <w:spacing w:after="40" w:line="252" w:lineRule="auto"/>
+            </w:pPr>
+            <w:r>
+              <w:rPr>
+                <w:rFonts w:ascii="Calibri" w:hAnsi="Calibri"/>
                 <w:b w:val="0"/>
                 <w:sz w:val="20"/>
               </w:rPr>
@@ -1701,14 +1715,15 @@
               <w:bottom w:w="80" w:type="dxa"/>
               <w:right w:w="80" w:type="dxa"/>
             </w:tcMar>
-          </w:tcPr>
-          <w:p>
-            <w:pPr>
-              <w:spacing w:after="40" w:line="252" w:lineRule="auto"/>
-            </w:pPr>
-            <w:r>
-              <w:rPr>
-                <w:rFonts w:ascii="Arial" w:hAnsi="Arial"/>
+            <w:shd w:fill="F5F8FC"/>
+          </w:tcPr>
+          <w:p>
+            <w:pPr>
+              <w:spacing w:after="40" w:line="252" w:lineRule="auto"/>
+            </w:pPr>
+            <w:r>
+              <w:rPr>
+                <w:rFonts w:ascii="Calibri" w:hAnsi="Calibri"/>
                 <w:b w:val="0"/>
                 <w:sz w:val="20"/>
               </w:rPr>
@@ -1732,14 +1747,15 @@
               <w:bottom w:w="80" w:type="dxa"/>
               <w:right w:w="80" w:type="dxa"/>
             </w:tcMar>
-          </w:tcPr>
-          <w:p>
-            <w:pPr>
-              <w:spacing w:after="40" w:line="252" w:lineRule="auto"/>
-            </w:pPr>
-            <w:r>
-              <w:rPr>
-                <w:rFonts w:ascii="Arial" w:hAnsi="Arial"/>
+            <w:shd w:fill="F5F8FC"/>
+          </w:tcPr>
+          <w:p>
+            <w:pPr>
+              <w:spacing w:after="40" w:line="252" w:lineRule="auto"/>
+            </w:pPr>
+            <w:r>
+              <w:rPr>
+                <w:rFonts w:ascii="Calibri" w:hAnsi="Calibri"/>
                 <w:b w:val="0"/>
                 <w:sz w:val="20"/>
               </w:rPr>
@@ -1775,7 +1791,7 @@
             </w:pPr>
             <w:r>
               <w:rPr>
-                <w:rFonts w:ascii="Arial" w:hAnsi="Arial"/>
+                <w:rFonts w:ascii="Calibri" w:hAnsi="Calibri"/>
                 <w:b w:val="0"/>
                 <w:sz w:val="20"/>
               </w:rPr>
@@ -1806,7 +1822,7 @@
             </w:pPr>
             <w:r>
               <w:rPr>
-                <w:rFonts w:ascii="Arial" w:hAnsi="Arial"/>
+                <w:rFonts w:ascii="Calibri" w:hAnsi="Calibri"/>
                 <w:b w:val="0"/>
                 <w:sz w:val="20"/>
               </w:rPr>
@@ -1837,7 +1853,7 @@
             </w:pPr>
             <w:r>
               <w:rPr>
-                <w:rFonts w:ascii="Arial" w:hAnsi="Arial"/>
+                <w:rFonts w:ascii="Calibri" w:hAnsi="Calibri"/>
                 <w:b w:val="0"/>
                 <w:sz w:val="20"/>
               </w:rPr>
@@ -1868,7 +1884,7 @@
             </w:pPr>
             <w:r>
               <w:rPr>
-                <w:rFonts w:ascii="Arial" w:hAnsi="Arial"/>
+                <w:rFonts w:ascii="Calibri" w:hAnsi="Calibri"/>
                 <w:b w:val="0"/>
                 <w:sz w:val="20"/>
               </w:rPr>
@@ -1897,14 +1913,15 @@
               <w:bottom w:w="80" w:type="dxa"/>
               <w:right w:w="80" w:type="dxa"/>
             </w:tcMar>
-          </w:tcPr>
-          <w:p>
-            <w:pPr>
-              <w:spacing w:after="40" w:line="252" w:lineRule="auto"/>
-            </w:pPr>
-            <w:r>
-              <w:rPr>
-                <w:rFonts w:ascii="Arial" w:hAnsi="Arial"/>
+            <w:shd w:fill="F5F8FC"/>
+          </w:tcPr>
+          <w:p>
+            <w:pPr>
+              <w:spacing w:after="40" w:line="252" w:lineRule="auto"/>
+            </w:pPr>
+            <w:r>
+              <w:rPr>
+                <w:rFonts w:ascii="Calibri" w:hAnsi="Calibri"/>
                 <w:b w:val="0"/>
                 <w:sz w:val="20"/>
               </w:rPr>
@@ -1928,14 +1945,15 @@
               <w:bottom w:w="80" w:type="dxa"/>
               <w:right w:w="80" w:type="dxa"/>
             </w:tcMar>
-          </w:tcPr>
-          <w:p>
-            <w:pPr>
-              <w:spacing w:after="40" w:line="252" w:lineRule="auto"/>
-            </w:pPr>
-            <w:r>
-              <w:rPr>
-                <w:rFonts w:ascii="Arial" w:hAnsi="Arial"/>
+            <w:shd w:fill="F5F8FC"/>
+          </w:tcPr>
+          <w:p>
+            <w:pPr>
+              <w:spacing w:after="40" w:line="252" w:lineRule="auto"/>
+            </w:pPr>
+            <w:r>
+              <w:rPr>
+                <w:rFonts w:ascii="Calibri" w:hAnsi="Calibri"/>
                 <w:b w:val="0"/>
                 <w:sz w:val="20"/>
               </w:rPr>
@@ -1961,14 +1979,15 @@
               <w:bottom w:w="80" w:type="dxa"/>
               <w:right w:w="80" w:type="dxa"/>
             </w:tcMar>
-          </w:tcPr>
-          <w:p>
-            <w:pPr>
-              <w:spacing w:after="40" w:line="252" w:lineRule="auto"/>
-            </w:pPr>
-            <w:r>
-              <w:rPr>
-                <w:rFonts w:ascii="Arial" w:hAnsi="Arial"/>
+            <w:shd w:fill="F5F8FC"/>
+          </w:tcPr>
+          <w:p>
+            <w:pPr>
+              <w:spacing w:after="40" w:line="252" w:lineRule="auto"/>
+            </w:pPr>
+            <w:r>
+              <w:rPr>
+                <w:rFonts w:ascii="Calibri" w:hAnsi="Calibri"/>
                 <w:b w:val="0"/>
                 <w:sz w:val="20"/>
               </w:rPr>
@@ -1994,14 +2013,15 @@
               <w:bottom w:w="80" w:type="dxa"/>
               <w:right w:w="80" w:type="dxa"/>
             </w:tcMar>
-          </w:tcPr>
-          <w:p>
-            <w:pPr>
-              <w:spacing w:after="40" w:line="252" w:lineRule="auto"/>
-            </w:pPr>
-            <w:r>
-              <w:rPr>
-                <w:rFonts w:ascii="Arial" w:hAnsi="Arial"/>
+            <w:shd w:fill="F5F8FC"/>
+          </w:tcPr>
+          <w:p>
+            <w:pPr>
+              <w:spacing w:after="40" w:line="252" w:lineRule="auto"/>
+            </w:pPr>
+            <w:r>
+              <w:rPr>
+                <w:rFonts w:ascii="Calibri" w:hAnsi="Calibri"/>
                 <w:b w:val="0"/>
                 <w:sz w:val="20"/>
               </w:rPr>
@@ -2037,7 +2057,7 @@
             </w:pPr>
             <w:r>
               <w:rPr>
-                <w:rFonts w:ascii="Arial" w:hAnsi="Arial"/>
+                <w:rFonts w:ascii="Calibri" w:hAnsi="Calibri"/>
                 <w:b w:val="0"/>
                 <w:sz w:val="20"/>
               </w:rPr>
@@ -2068,7 +2088,7 @@
             </w:pPr>
             <w:r>
               <w:rPr>
-                <w:rFonts w:ascii="Arial" w:hAnsi="Arial"/>
+                <w:rFonts w:ascii="Calibri" w:hAnsi="Calibri"/>
                 <w:b w:val="0"/>
                 <w:sz w:val="20"/>
               </w:rPr>
@@ -2099,7 +2119,7 @@
             </w:pPr>
             <w:r>
               <w:rPr>
-                <w:rFonts w:ascii="Arial" w:hAnsi="Arial"/>
+                <w:rFonts w:ascii="Calibri" w:hAnsi="Calibri"/>
                 <w:b w:val="0"/>
                 <w:sz w:val="20"/>
               </w:rPr>
@@ -2130,7 +2150,7 @@
             </w:pPr>
             <w:r>
               <w:rPr>
-                <w:rFonts w:ascii="Arial" w:hAnsi="Arial"/>
+                <w:rFonts w:ascii="Calibri" w:hAnsi="Calibri"/>
                 <w:b w:val="0"/>
                 <w:sz w:val="20"/>
               </w:rPr>
@@ -2159,14 +2179,15 @@
               <w:bottom w:w="80" w:type="dxa"/>
               <w:right w:w="80" w:type="dxa"/>
             </w:tcMar>
-          </w:tcPr>
-          <w:p>
-            <w:pPr>
-              <w:spacing w:after="40" w:line="252" w:lineRule="auto"/>
-            </w:pPr>
-            <w:r>
-              <w:rPr>
-                <w:rFonts w:ascii="Arial" w:hAnsi="Arial"/>
+            <w:shd w:fill="F5F8FC"/>
+          </w:tcPr>
+          <w:p>
+            <w:pPr>
+              <w:spacing w:after="40" w:line="252" w:lineRule="auto"/>
+            </w:pPr>
+            <w:r>
+              <w:rPr>
+                <w:rFonts w:ascii="Calibri" w:hAnsi="Calibri"/>
                 <w:b w:val="0"/>
                 <w:sz w:val="20"/>
               </w:rPr>
@@ -2190,14 +2211,15 @@
               <w:bottom w:w="80" w:type="dxa"/>
               <w:right w:w="80" w:type="dxa"/>
             </w:tcMar>
-          </w:tcPr>
-          <w:p>
-            <w:pPr>
-              <w:spacing w:after="40" w:line="252" w:lineRule="auto"/>
-            </w:pPr>
-            <w:r>
-              <w:rPr>
-                <w:rFonts w:ascii="Arial" w:hAnsi="Arial"/>
+            <w:shd w:fill="F5F8FC"/>
+          </w:tcPr>
+          <w:p>
+            <w:pPr>
+              <w:spacing w:after="40" w:line="252" w:lineRule="auto"/>
+            </w:pPr>
+            <w:r>
+              <w:rPr>
+                <w:rFonts w:ascii="Calibri" w:hAnsi="Calibri"/>
                 <w:b w:val="0"/>
                 <w:sz w:val="20"/>
               </w:rPr>
@@ -2221,14 +2243,15 @@
               <w:bottom w:w="80" w:type="dxa"/>
               <w:right w:w="80" w:type="dxa"/>
             </w:tcMar>
-          </w:tcPr>
-          <w:p>
-            <w:pPr>
-              <w:spacing w:after="40" w:line="252" w:lineRule="auto"/>
-            </w:pPr>
-            <w:r>
-              <w:rPr>
-                <w:rFonts w:ascii="Arial" w:hAnsi="Arial"/>
+            <w:shd w:fill="F5F8FC"/>
+          </w:tcPr>
+          <w:p>
+            <w:pPr>
+              <w:spacing w:after="40" w:line="252" w:lineRule="auto"/>
+            </w:pPr>
+            <w:r>
+              <w:rPr>
+                <w:rFonts w:ascii="Calibri" w:hAnsi="Calibri"/>
                 <w:b w:val="0"/>
                 <w:sz w:val="20"/>
               </w:rPr>
@@ -2252,14 +2275,15 @@
               <w:bottom w:w="80" w:type="dxa"/>
               <w:right w:w="80" w:type="dxa"/>
             </w:tcMar>
-          </w:tcPr>
-          <w:p>
-            <w:pPr>
-              <w:spacing w:after="40" w:line="252" w:lineRule="auto"/>
-            </w:pPr>
-            <w:r>
-              <w:rPr>
-                <w:rFonts w:ascii="Arial" w:hAnsi="Arial"/>
+            <w:shd w:fill="F5F8FC"/>
+          </w:tcPr>
+          <w:p>
+            <w:pPr>
+              <w:spacing w:after="40" w:line="252" w:lineRule="auto"/>
+            </w:pPr>
+            <w:r>
+              <w:rPr>
+                <w:rFonts w:ascii="Calibri" w:hAnsi="Calibri"/>
                 <w:b w:val="0"/>
                 <w:sz w:val="20"/>
               </w:rPr>
@@ -2295,7 +2319,7 @@
             </w:pPr>
             <w:r>
               <w:rPr>
-                <w:rFonts w:ascii="Arial" w:hAnsi="Arial"/>
+                <w:rFonts w:ascii="Calibri" w:hAnsi="Calibri"/>
                 <w:b w:val="0"/>
                 <w:sz w:val="20"/>
               </w:rPr>
@@ -2326,7 +2350,7 @@
             </w:pPr>
             <w:r>
               <w:rPr>
-                <w:rFonts w:ascii="Arial" w:hAnsi="Arial"/>
+                <w:rFonts w:ascii="Calibri" w:hAnsi="Calibri"/>
                 <w:b w:val="0"/>
                 <w:sz w:val="20"/>
               </w:rPr>
@@ -2357,7 +2381,7 @@
             </w:pPr>
             <w:r>
               <w:rPr>
-                <w:rFonts w:ascii="Arial" w:hAnsi="Arial"/>
+                <w:rFonts w:ascii="Calibri" w:hAnsi="Calibri"/>
                 <w:b w:val="0"/>
                 <w:sz w:val="20"/>
               </w:rPr>
@@ -2388,7 +2412,7 @@
             </w:pPr>
             <w:r>
               <w:rPr>
-                <w:rFonts w:ascii="Arial" w:hAnsi="Arial"/>
+                <w:rFonts w:ascii="Calibri" w:hAnsi="Calibri"/>
                 <w:b w:val="0"/>
                 <w:sz w:val="20"/>
               </w:rPr>
@@ -2406,7 +2430,7 @@
       </w:pPr>
       <w:r>
         <w:rPr>
-          <w:rFonts w:ascii="Arial" w:hAnsi="Arial"/>
+          <w:rFonts w:ascii="Calibri" w:hAnsi="Calibri"/>
           <w:b w:val="0"/>
           <w:color w:val="000000"/>
           <w:sz w:val="24"/>
@@ -2424,10 +2448,10 @@
       </w:pPr>
       <w:r>
         <w:rPr>
-          <w:rFonts w:ascii="Arial" w:hAnsi="Arial"/>
+          <w:rFonts w:ascii="Calibri" w:hAnsi="Calibri"/>
           <w:b/>
-          <w:color w:val="000000"/>
-          <w:sz w:val="24"/>
+          <w:color w:val="20334D"/>
+          <w:sz w:val="26"/>
         </w:rPr>
         <w:t>Additional checks</w:t>
       </w:r>
@@ -2440,7 +2464,7 @@
       </w:pPr>
       <w:r>
         <w:rPr>
-          <w:rFonts w:ascii="Arial" w:hAnsi="Arial"/>
+          <w:rFonts w:ascii="Calibri" w:hAnsi="Calibri"/>
           <w:b w:val="0"/>
           <w:color w:val="000000"/>
           <w:sz w:val="24"/>
@@ -2450,7 +2474,7 @@
     </w:p>
     <w:p>
       <w:pPr>
-        <w:shd w:val="clear" w:color="auto" w:fill="121314"/>
+        <w:shd w:val="clear" w:color="auto" w:fill="EDF3FB"/>
         <w:spacing w:after="0" w:line="285" w:lineRule="atLeast"/>
         <w:rPr>
           <w:rFonts w:ascii="Consolas" w:eastAsia="Times New Roman" w:hAnsi="Consolas" w:cs="Times New Roman"/>
@@ -2466,7 +2490,7 @@
         <w:rPr>
           <w:rFonts w:ascii="Consolas" w:hAnsi="Consolas"/>
           <w:b w:val="0"/>
-          <w:color w:val="D4D4D4"/>
+          <w:color w:val="20334D"/>
           <w:sz w:val="21"/>
         </w:rPr>
         <w:t>&lt;input type="time" min="09:00" max="18:00"</w:t>
@@ -2474,7 +2498,7 @@
     </w:p>
     <w:p>
       <w:pPr>
-        <w:shd w:val="clear" w:color="auto" w:fill="121314"/>
+        <w:shd w:val="clear" w:color="auto" w:fill="EDF3FB"/>
         <w:spacing w:after="0" w:line="285" w:lineRule="atLeast"/>
         <w:rPr>
           <w:rFonts w:ascii="Consolas" w:eastAsia="Times New Roman" w:hAnsi="Consolas" w:cs="Times New Roman"/>
@@ -2490,7 +2514,7 @@
         <w:rPr>
           <w:rFonts w:ascii="Consolas" w:hAnsi="Consolas"/>
           <w:b w:val="0"/>
-          <w:color w:val="D4D4D4"/>
+          <w:color w:val="20334D"/>
           <w:sz w:val="21"/>
         </w:rPr>
         <w:t xml:space="preserve">       step="1800" required&gt;</w:t>
@@ -2498,7 +2522,7 @@
     </w:p>
     <w:p>
       <w:pPr>
-        <w:shd w:val="clear" w:color="auto" w:fill="121314"/>
+        <w:shd w:val="clear" w:color="auto" w:fill="EDF3FB"/>
         <w:spacing w:after="0" w:line="285" w:lineRule="atLeast"/>
         <w:rPr>
           <w:rFonts w:ascii="Consolas" w:eastAsia="Times New Roman" w:hAnsi="Consolas" w:cs="Times New Roman"/>
@@ -2514,7 +2538,7 @@
         <w:rPr>
           <w:rFonts w:ascii="Consolas" w:hAnsi="Consolas"/>
           <w:b w:val="0"/>
-          <w:color w:val="D4D4D4"/>
+          <w:color w:val="20334D"/>
           <w:sz w:val="21"/>
         </w:rPr>
         <w:t>&lt;input type="number" min="0" max="5000"</w:t>
@@ -2522,7 +2546,7 @@
     </w:p>
     <w:p>
       <w:pPr>
-        <w:shd w:val="clear" w:color="auto" w:fill="121314"/>
+        <w:shd w:val="clear" w:color="auto" w:fill="EDF3FB"/>
         <w:spacing w:after="0" w:line="285" w:lineRule="atLeast"/>
         <w:rPr>
           <w:rFonts w:ascii="Consolas" w:eastAsia="Times New Roman" w:hAnsi="Consolas" w:cs="Times New Roman"/>
@@ -2538,7 +2562,7 @@
         <w:rPr>
           <w:rFonts w:ascii="Consolas" w:hAnsi="Consolas"/>
           <w:b w:val="0"/>
-          <w:color w:val="D4D4D4"/>
+          <w:color w:val="20334D"/>
           <w:sz w:val="21"/>
         </w:rPr>
         <w:t xml:space="preserve">       step="500" required&gt;</w:t>
@@ -2552,7 +2576,7 @@
       </w:pPr>
       <w:r>
         <w:rPr>
-          <w:rFonts w:ascii="Arial" w:hAnsi="Arial"/>
+          <w:rFonts w:ascii="Calibri" w:hAnsi="Calibri"/>
           <w:b w:val="0"/>
           <w:color w:val="000000"/>
           <w:sz w:val="24"/>
@@ -2567,7 +2591,7 @@
       </w:pPr>
       <w:r>
         <w:rPr>
-          <w:rFonts w:ascii="Arial" w:hAnsi="Arial"/>
+          <w:rFonts w:ascii="Calibri" w:hAnsi="Calibri"/>
           <w:b w:val="0"/>
           <w:color w:val="000000"/>
           <w:sz w:val="24"/>
@@ -2587,10 +2611,10 @@
       </w:pPr>
       <w:r>
         <w:rPr>
-          <w:rFonts w:ascii="Arial" w:hAnsi="Arial"/>
+          <w:rFonts w:ascii="Calibri" w:hAnsi="Calibri"/>
           <w:b/>
-          <w:color w:val="000000"/>
-          <w:sz w:val="24"/>
+          <w:color w:val="20334D"/>
+          <w:sz w:val="26"/>
         </w:rPr>
         <w:t>Task 3  Corrected café reservation</w:t>
       </w:r>
@@ -2643,7 +2667,7 @@
       </w:pPr>
       <w:r>
         <w:rPr>
-          <w:rFonts w:ascii="Arial" w:hAnsi="Arial"/>
+          <w:rFonts w:ascii="Calibri" w:hAnsi="Calibri"/>
           <w:b w:val="0"/>
           <w:color w:val="000000"/>
           <w:sz w:val="20"/>
@@ -2659,12 +2683,12 @@
       </w:pPr>
       <w:r>
         <w:rPr>
-          <w:rFonts w:ascii="Arial" w:hAnsi="Arial"/>
+          <w:rFonts w:ascii="Calibri" w:hAnsi="Calibri"/>
           <w:b w:val="0"/>
           <w:color w:val="000000"/>
           <w:sz w:val="24"/>
         </w:rPr>
-        <w:t>I added connected labels and names, appropriate input types, a seating fieldset and a real submit button. The form stacks on a phone. The seating options share one name and have different values.</w:t>
+        <w:t>The café form uses the same blue accents, white heading and compact corners. I added connected labels and names, appropriate input types, a seating fieldset and a submit button. Seating options share one name and have different values.</w:t>
       </w:r>
     </w:p>
     <w:p>
@@ -2675,7 +2699,7 @@
       </w:pPr>
       <w:r>
         <w:rPr>
-          <w:rFonts w:ascii="Arial" w:hAnsi="Arial"/>
+          <w:rFonts w:ascii="Calibri" w:hAnsi="Calibri"/>
           <w:b w:val="0"/>
           <w:color w:val="000000"/>
           <w:sz w:val="24"/>
@@ -2695,10 +2719,10 @@
       </w:pPr>
       <w:r>
         <w:rPr>
-          <w:rFonts w:ascii="Arial" w:hAnsi="Arial"/>
+          <w:rFonts w:ascii="Calibri" w:hAnsi="Calibri"/>
           <w:b/>
-          <w:color w:val="000000"/>
-          <w:sz w:val="24"/>
+          <w:color w:val="20334D"/>
+          <w:sz w:val="26"/>
         </w:rPr>
         <w:t>Task 3  Problems in the original form</w:t>
       </w:r>
@@ -2711,7 +2735,7 @@
       </w:pPr>
       <w:r>
         <w:rPr>
-          <w:rFonts w:ascii="Arial" w:hAnsi="Arial"/>
+          <w:rFonts w:ascii="Calibri" w:hAnsi="Calibri"/>
           <w:b w:val="0"/>
           <w:color w:val="000000"/>
           <w:sz w:val="24"/>
@@ -2752,15 +2776,15 @@
               <w:bottom w:w="80" w:type="dxa"/>
               <w:right w:w="80" w:type="dxa"/>
             </w:tcMar>
-            <w:shd w:fill="EEEEEE"/>
-          </w:tcPr>
-          <w:p>
-            <w:pPr>
-              <w:spacing w:after="40" w:line="252" w:lineRule="auto"/>
-            </w:pPr>
-            <w:r>
-              <w:rPr>
-                <w:rFonts w:ascii="Arial" w:hAnsi="Arial"/>
+            <w:shd w:fill="DCE8F8"/>
+          </w:tcPr>
+          <w:p>
+            <w:pPr>
+              <w:spacing w:after="40" w:line="252" w:lineRule="auto"/>
+            </w:pPr>
+            <w:r>
+              <w:rPr>
+                <w:rFonts w:ascii="Calibri" w:hAnsi="Calibri"/>
                 <w:b/>
                 <w:sz w:val="20"/>
               </w:rPr>
@@ -2784,15 +2808,15 @@
               <w:bottom w:w="80" w:type="dxa"/>
               <w:right w:w="80" w:type="dxa"/>
             </w:tcMar>
-            <w:shd w:fill="EEEEEE"/>
-          </w:tcPr>
-          <w:p>
-            <w:pPr>
-              <w:spacing w:after="40" w:line="252" w:lineRule="auto"/>
-            </w:pPr>
-            <w:r>
-              <w:rPr>
-                <w:rFonts w:ascii="Arial" w:hAnsi="Arial"/>
+            <w:shd w:fill="DCE8F8"/>
+          </w:tcPr>
+          <w:p>
+            <w:pPr>
+              <w:spacing w:after="40" w:line="252" w:lineRule="auto"/>
+            </w:pPr>
+            <w:r>
+              <w:rPr>
+                <w:rFonts w:ascii="Calibri" w:hAnsi="Calibri"/>
                 <w:b/>
                 <w:sz w:val="20"/>
               </w:rPr>
@@ -2816,15 +2840,15 @@
               <w:bottom w:w="80" w:type="dxa"/>
               <w:right w:w="80" w:type="dxa"/>
             </w:tcMar>
-            <w:shd w:fill="EEEEEE"/>
-          </w:tcPr>
-          <w:p>
-            <w:pPr>
-              <w:spacing w:after="40" w:line="252" w:lineRule="auto"/>
-            </w:pPr>
-            <w:r>
-              <w:rPr>
-                <w:rFonts w:ascii="Arial" w:hAnsi="Arial"/>
+            <w:shd w:fill="DCE8F8"/>
+          </w:tcPr>
+          <w:p>
+            <w:pPr>
+              <w:spacing w:after="40" w:line="252" w:lineRule="auto"/>
+            </w:pPr>
+            <w:r>
+              <w:rPr>
+                <w:rFonts w:ascii="Calibri" w:hAnsi="Calibri"/>
                 <w:b/>
                 <w:sz w:val="20"/>
               </w:rPr>
@@ -2860,7 +2884,7 @@
             </w:pPr>
             <w:r>
               <w:rPr>
-                <w:rFonts w:ascii="Arial" w:hAnsi="Arial"/>
+                <w:rFonts w:ascii="Calibri" w:hAnsi="Calibri"/>
                 <w:b w:val="0"/>
                 <w:sz w:val="20"/>
               </w:rPr>
@@ -2891,7 +2915,7 @@
             </w:pPr>
             <w:r>
               <w:rPr>
-                <w:rFonts w:ascii="Arial" w:hAnsi="Arial"/>
+                <w:rFonts w:ascii="Calibri" w:hAnsi="Calibri"/>
                 <w:b w:val="0"/>
                 <w:sz w:val="20"/>
               </w:rPr>
@@ -2922,7 +2946,7 @@
             </w:pPr>
             <w:r>
               <w:rPr>
-                <w:rFonts w:ascii="Arial" w:hAnsi="Arial"/>
+                <w:rFonts w:ascii="Calibri" w:hAnsi="Calibri"/>
                 <w:b w:val="0"/>
                 <w:sz w:val="20"/>
               </w:rPr>
@@ -2951,14 +2975,15 @@
               <w:bottom w:w="80" w:type="dxa"/>
               <w:right w:w="80" w:type="dxa"/>
             </w:tcMar>
-          </w:tcPr>
-          <w:p>
-            <w:pPr>
-              <w:spacing w:after="40" w:line="252" w:lineRule="auto"/>
-            </w:pPr>
-            <w:r>
-              <w:rPr>
-                <w:rFonts w:ascii="Arial" w:hAnsi="Arial"/>
+            <w:shd w:fill="F5F8FC"/>
+          </w:tcPr>
+          <w:p>
+            <w:pPr>
+              <w:spacing w:after="40" w:line="252" w:lineRule="auto"/>
+            </w:pPr>
+            <w:r>
+              <w:rPr>
+                <w:rFonts w:ascii="Calibri" w:hAnsi="Calibri"/>
                 <w:b w:val="0"/>
                 <w:sz w:val="20"/>
               </w:rPr>
@@ -2982,14 +3007,15 @@
               <w:bottom w:w="80" w:type="dxa"/>
               <w:right w:w="80" w:type="dxa"/>
             </w:tcMar>
-          </w:tcPr>
-          <w:p>
-            <w:pPr>
-              <w:spacing w:after="40" w:line="252" w:lineRule="auto"/>
-            </w:pPr>
-            <w:r>
-              <w:rPr>
-                <w:rFonts w:ascii="Arial" w:hAnsi="Arial"/>
+            <w:shd w:fill="F5F8FC"/>
+          </w:tcPr>
+          <w:p>
+            <w:pPr>
+              <w:spacing w:after="40" w:line="252" w:lineRule="auto"/>
+            </w:pPr>
+            <w:r>
+              <w:rPr>
+                <w:rFonts w:ascii="Calibri" w:hAnsi="Calibri"/>
                 <w:b w:val="0"/>
                 <w:sz w:val="20"/>
               </w:rPr>
@@ -3013,14 +3039,15 @@
               <w:bottom w:w="80" w:type="dxa"/>
               <w:right w:w="80" w:type="dxa"/>
             </w:tcMar>
-          </w:tcPr>
-          <w:p>
-            <w:pPr>
-              <w:spacing w:after="40" w:line="252" w:lineRule="auto"/>
-            </w:pPr>
-            <w:r>
-              <w:rPr>
-                <w:rFonts w:ascii="Arial" w:hAnsi="Arial"/>
+            <w:shd w:fill="F5F8FC"/>
+          </w:tcPr>
+          <w:p>
+            <w:pPr>
+              <w:spacing w:after="40" w:line="252" w:lineRule="auto"/>
+            </w:pPr>
+            <w:r>
+              <w:rPr>
+                <w:rFonts w:ascii="Calibri" w:hAnsi="Calibri"/>
                 <w:b w:val="0"/>
                 <w:sz w:val="20"/>
               </w:rPr>
@@ -3056,7 +3083,7 @@
             </w:pPr>
             <w:r>
               <w:rPr>
-                <w:rFonts w:ascii="Arial" w:hAnsi="Arial"/>
+                <w:rFonts w:ascii="Calibri" w:hAnsi="Calibri"/>
                 <w:b w:val="0"/>
                 <w:sz w:val="20"/>
               </w:rPr>
@@ -3087,7 +3114,7 @@
             </w:pPr>
             <w:r>
               <w:rPr>
-                <w:rFonts w:ascii="Arial" w:hAnsi="Arial"/>
+                <w:rFonts w:ascii="Calibri" w:hAnsi="Calibri"/>
                 <w:b w:val="0"/>
                 <w:sz w:val="20"/>
               </w:rPr>
@@ -3118,7 +3145,7 @@
             </w:pPr>
             <w:r>
               <w:rPr>
-                <w:rFonts w:ascii="Arial" w:hAnsi="Arial"/>
+                <w:rFonts w:ascii="Calibri" w:hAnsi="Calibri"/>
                 <w:b w:val="0"/>
                 <w:sz w:val="20"/>
               </w:rPr>
@@ -3147,14 +3174,15 @@
               <w:bottom w:w="80" w:type="dxa"/>
               <w:right w:w="80" w:type="dxa"/>
             </w:tcMar>
-          </w:tcPr>
-          <w:p>
-            <w:pPr>
-              <w:spacing w:after="40" w:line="252" w:lineRule="auto"/>
-            </w:pPr>
-            <w:r>
-              <w:rPr>
-                <w:rFonts w:ascii="Arial" w:hAnsi="Arial"/>
+            <w:shd w:fill="F5F8FC"/>
+          </w:tcPr>
+          <w:p>
+            <w:pPr>
+              <w:spacing w:after="40" w:line="252" w:lineRule="auto"/>
+            </w:pPr>
+            <w:r>
+              <w:rPr>
+                <w:rFonts w:ascii="Calibri" w:hAnsi="Calibri"/>
                 <w:b w:val="0"/>
                 <w:sz w:val="20"/>
               </w:rPr>
@@ -3178,14 +3206,15 @@
               <w:bottom w:w="80" w:type="dxa"/>
               <w:right w:w="80" w:type="dxa"/>
             </w:tcMar>
-          </w:tcPr>
-          <w:p>
-            <w:pPr>
-              <w:spacing w:after="40" w:line="252" w:lineRule="auto"/>
-            </w:pPr>
-            <w:r>
-              <w:rPr>
-                <w:rFonts w:ascii="Arial" w:hAnsi="Arial"/>
+            <w:shd w:fill="F5F8FC"/>
+          </w:tcPr>
+          <w:p>
+            <w:pPr>
+              <w:spacing w:after="40" w:line="252" w:lineRule="auto"/>
+            </w:pPr>
+            <w:r>
+              <w:rPr>
+                <w:rFonts w:ascii="Calibri" w:hAnsi="Calibri"/>
                 <w:b w:val="0"/>
                 <w:sz w:val="20"/>
               </w:rPr>
@@ -3209,14 +3238,15 @@
               <w:bottom w:w="80" w:type="dxa"/>
               <w:right w:w="80" w:type="dxa"/>
             </w:tcMar>
-          </w:tcPr>
-          <w:p>
-            <w:pPr>
-              <w:spacing w:after="40" w:line="252" w:lineRule="auto"/>
-            </w:pPr>
-            <w:r>
-              <w:rPr>
-                <w:rFonts w:ascii="Arial" w:hAnsi="Arial"/>
+            <w:shd w:fill="F5F8FC"/>
+          </w:tcPr>
+          <w:p>
+            <w:pPr>
+              <w:spacing w:after="40" w:line="252" w:lineRule="auto"/>
+            </w:pPr>
+            <w:r>
+              <w:rPr>
+                <w:rFonts w:ascii="Calibri" w:hAnsi="Calibri"/>
                 <w:b w:val="0"/>
                 <w:sz w:val="20"/>
               </w:rPr>
@@ -3252,7 +3282,7 @@
             </w:pPr>
             <w:r>
               <w:rPr>
-                <w:rFonts w:ascii="Arial" w:hAnsi="Arial"/>
+                <w:rFonts w:ascii="Calibri" w:hAnsi="Calibri"/>
                 <w:b w:val="0"/>
                 <w:sz w:val="20"/>
               </w:rPr>
@@ -3283,7 +3313,7 @@
             </w:pPr>
             <w:r>
               <w:rPr>
-                <w:rFonts w:ascii="Arial" w:hAnsi="Arial"/>
+                <w:rFonts w:ascii="Calibri" w:hAnsi="Calibri"/>
                 <w:b w:val="0"/>
                 <w:sz w:val="20"/>
               </w:rPr>
@@ -3314,7 +3344,7 @@
             </w:pPr>
             <w:r>
               <w:rPr>
-                <w:rFonts w:ascii="Arial" w:hAnsi="Arial"/>
+                <w:rFonts w:ascii="Calibri" w:hAnsi="Calibri"/>
                 <w:b w:val="0"/>
                 <w:sz w:val="20"/>
               </w:rPr>
@@ -3343,14 +3373,15 @@
               <w:bottom w:w="80" w:type="dxa"/>
               <w:right w:w="80" w:type="dxa"/>
             </w:tcMar>
-          </w:tcPr>
-          <w:p>
-            <w:pPr>
-              <w:spacing w:after="40" w:line="252" w:lineRule="auto"/>
-            </w:pPr>
-            <w:r>
-              <w:rPr>
-                <w:rFonts w:ascii="Arial" w:hAnsi="Arial"/>
+            <w:shd w:fill="F5F8FC"/>
+          </w:tcPr>
+          <w:p>
+            <w:pPr>
+              <w:spacing w:after="40" w:line="252" w:lineRule="auto"/>
+            </w:pPr>
+            <w:r>
+              <w:rPr>
+                <w:rFonts w:ascii="Calibri" w:hAnsi="Calibri"/>
                 <w:b w:val="0"/>
                 <w:sz w:val="20"/>
               </w:rPr>
@@ -3374,14 +3405,15 @@
               <w:bottom w:w="80" w:type="dxa"/>
               <w:right w:w="80" w:type="dxa"/>
             </w:tcMar>
-          </w:tcPr>
-          <w:p>
-            <w:pPr>
-              <w:spacing w:after="40" w:line="252" w:lineRule="auto"/>
-            </w:pPr>
-            <w:r>
-              <w:rPr>
-                <w:rFonts w:ascii="Arial" w:hAnsi="Arial"/>
+            <w:shd w:fill="F5F8FC"/>
+          </w:tcPr>
+          <w:p>
+            <w:pPr>
+              <w:spacing w:after="40" w:line="252" w:lineRule="auto"/>
+            </w:pPr>
+            <w:r>
+              <w:rPr>
+                <w:rFonts w:ascii="Calibri" w:hAnsi="Calibri"/>
                 <w:b w:val="0"/>
                 <w:sz w:val="20"/>
               </w:rPr>
@@ -3405,14 +3437,15 @@
               <w:bottom w:w="80" w:type="dxa"/>
               <w:right w:w="80" w:type="dxa"/>
             </w:tcMar>
-          </w:tcPr>
-          <w:p>
-            <w:pPr>
-              <w:spacing w:after="40" w:line="252" w:lineRule="auto"/>
-            </w:pPr>
-            <w:r>
-              <w:rPr>
-                <w:rFonts w:ascii="Arial" w:hAnsi="Arial"/>
+            <w:shd w:fill="F5F8FC"/>
+          </w:tcPr>
+          <w:p>
+            <w:pPr>
+              <w:spacing w:after="40" w:line="252" w:lineRule="auto"/>
+            </w:pPr>
+            <w:r>
+              <w:rPr>
+                <w:rFonts w:ascii="Calibri" w:hAnsi="Calibri"/>
                 <w:b w:val="0"/>
                 <w:sz w:val="20"/>
               </w:rPr>
@@ -3448,7 +3481,7 @@
             </w:pPr>
             <w:r>
               <w:rPr>
-                <w:rFonts w:ascii="Arial" w:hAnsi="Arial"/>
+                <w:rFonts w:ascii="Calibri" w:hAnsi="Calibri"/>
                 <w:b w:val="0"/>
                 <w:sz w:val="20"/>
               </w:rPr>
@@ -3479,7 +3512,7 @@
             </w:pPr>
             <w:r>
               <w:rPr>
-                <w:rFonts w:ascii="Arial" w:hAnsi="Arial"/>
+                <w:rFonts w:ascii="Calibri" w:hAnsi="Calibri"/>
                 <w:b w:val="0"/>
                 <w:sz w:val="20"/>
               </w:rPr>
@@ -3510,7 +3543,7 @@
             </w:pPr>
             <w:r>
               <w:rPr>
-                <w:rFonts w:ascii="Arial" w:hAnsi="Arial"/>
+                <w:rFonts w:ascii="Calibri" w:hAnsi="Calibri"/>
                 <w:b w:val="0"/>
                 <w:sz w:val="20"/>
               </w:rPr>
@@ -3539,14 +3572,15 @@
               <w:bottom w:w="80" w:type="dxa"/>
               <w:right w:w="80" w:type="dxa"/>
             </w:tcMar>
-          </w:tcPr>
-          <w:p>
-            <w:pPr>
-              <w:spacing w:after="40" w:line="252" w:lineRule="auto"/>
-            </w:pPr>
-            <w:r>
-              <w:rPr>
-                <w:rFonts w:ascii="Arial" w:hAnsi="Arial"/>
+            <w:shd w:fill="F5F8FC"/>
+          </w:tcPr>
+          <w:p>
+            <w:pPr>
+              <w:spacing w:after="40" w:line="252" w:lineRule="auto"/>
+            </w:pPr>
+            <w:r>
+              <w:rPr>
+                <w:rFonts w:ascii="Calibri" w:hAnsi="Calibri"/>
                 <w:b w:val="0"/>
                 <w:sz w:val="20"/>
               </w:rPr>
@@ -3570,14 +3604,15 @@
               <w:bottom w:w="80" w:type="dxa"/>
               <w:right w:w="80" w:type="dxa"/>
             </w:tcMar>
-          </w:tcPr>
-          <w:p>
-            <w:pPr>
-              <w:spacing w:after="40" w:line="252" w:lineRule="auto"/>
-            </w:pPr>
-            <w:r>
-              <w:rPr>
-                <w:rFonts w:ascii="Arial" w:hAnsi="Arial"/>
+            <w:shd w:fill="F5F8FC"/>
+          </w:tcPr>
+          <w:p>
+            <w:pPr>
+              <w:spacing w:after="40" w:line="252" w:lineRule="auto"/>
+            </w:pPr>
+            <w:r>
+              <w:rPr>
+                <w:rFonts w:ascii="Calibri" w:hAnsi="Calibri"/>
                 <w:b w:val="0"/>
                 <w:sz w:val="20"/>
               </w:rPr>
@@ -3601,14 +3636,15 @@
               <w:bottom w:w="80" w:type="dxa"/>
               <w:right w:w="80" w:type="dxa"/>
             </w:tcMar>
-          </w:tcPr>
-          <w:p>
-            <w:pPr>
-              <w:spacing w:after="40" w:line="252" w:lineRule="auto"/>
-            </w:pPr>
-            <w:r>
-              <w:rPr>
-                <w:rFonts w:ascii="Arial" w:hAnsi="Arial"/>
+            <w:shd w:fill="F5F8FC"/>
+          </w:tcPr>
+          <w:p>
+            <w:pPr>
+              <w:spacing w:after="40" w:line="252" w:lineRule="auto"/>
+            </w:pPr>
+            <w:r>
+              <w:rPr>
+                <w:rFonts w:ascii="Calibri" w:hAnsi="Calibri"/>
                 <w:b w:val="0"/>
                 <w:sz w:val="20"/>
               </w:rPr>
@@ -3644,7 +3680,7 @@
             </w:pPr>
             <w:r>
               <w:rPr>
-                <w:rFonts w:ascii="Arial" w:hAnsi="Arial"/>
+                <w:rFonts w:ascii="Calibri" w:hAnsi="Calibri"/>
                 <w:b w:val="0"/>
                 <w:sz w:val="20"/>
               </w:rPr>
@@ -3675,7 +3711,7 @@
             </w:pPr>
             <w:r>
               <w:rPr>
-                <w:rFonts w:ascii="Arial" w:hAnsi="Arial"/>
+                <w:rFonts w:ascii="Calibri" w:hAnsi="Calibri"/>
                 <w:b w:val="0"/>
                 <w:sz w:val="20"/>
               </w:rPr>
@@ -3706,7 +3742,7 @@
             </w:pPr>
             <w:r>
               <w:rPr>
-                <w:rFonts w:ascii="Arial" w:hAnsi="Arial"/>
+                <w:rFonts w:ascii="Calibri" w:hAnsi="Calibri"/>
                 <w:b w:val="0"/>
                 <w:sz w:val="20"/>
               </w:rPr>
@@ -3735,14 +3771,15 @@
               <w:bottom w:w="80" w:type="dxa"/>
               <w:right w:w="80" w:type="dxa"/>
             </w:tcMar>
-          </w:tcPr>
-          <w:p>
-            <w:pPr>
-              <w:spacing w:after="40" w:line="252" w:lineRule="auto"/>
-            </w:pPr>
-            <w:r>
-              <w:rPr>
-                <w:rFonts w:ascii="Arial" w:hAnsi="Arial"/>
+            <w:shd w:fill="F5F8FC"/>
+          </w:tcPr>
+          <w:p>
+            <w:pPr>
+              <w:spacing w:after="40" w:line="252" w:lineRule="auto"/>
+            </w:pPr>
+            <w:r>
+              <w:rPr>
+                <w:rFonts w:ascii="Calibri" w:hAnsi="Calibri"/>
                 <w:b w:val="0"/>
                 <w:sz w:val="20"/>
               </w:rPr>
@@ -3766,14 +3803,15 @@
               <w:bottom w:w="80" w:type="dxa"/>
               <w:right w:w="80" w:type="dxa"/>
             </w:tcMar>
-          </w:tcPr>
-          <w:p>
-            <w:pPr>
-              <w:spacing w:after="40" w:line="252" w:lineRule="auto"/>
-            </w:pPr>
-            <w:r>
-              <w:rPr>
-                <w:rFonts w:ascii="Arial" w:hAnsi="Arial"/>
+            <w:shd w:fill="F5F8FC"/>
+          </w:tcPr>
+          <w:p>
+            <w:pPr>
+              <w:spacing w:after="40" w:line="252" w:lineRule="auto"/>
+            </w:pPr>
+            <w:r>
+              <w:rPr>
+                <w:rFonts w:ascii="Calibri" w:hAnsi="Calibri"/>
                 <w:b w:val="0"/>
                 <w:sz w:val="20"/>
               </w:rPr>
@@ -3797,14 +3835,15 @@
               <w:bottom w:w="80" w:type="dxa"/>
               <w:right w:w="80" w:type="dxa"/>
             </w:tcMar>
-          </w:tcPr>
-          <w:p>
-            <w:pPr>
-              <w:spacing w:after="40" w:line="252" w:lineRule="auto"/>
-            </w:pPr>
-            <w:r>
-              <w:rPr>
-                <w:rFonts w:ascii="Arial" w:hAnsi="Arial"/>
+            <w:shd w:fill="F5F8FC"/>
+          </w:tcPr>
+          <w:p>
+            <w:pPr>
+              <w:spacing w:after="40" w:line="252" w:lineRule="auto"/>
+            </w:pPr>
+            <w:r>
+              <w:rPr>
+                <w:rFonts w:ascii="Calibri" w:hAnsi="Calibri"/>
                 <w:b w:val="0"/>
                 <w:sz w:val="20"/>
               </w:rPr>
@@ -3840,7 +3879,7 @@
             </w:pPr>
             <w:r>
               <w:rPr>
-                <w:rFonts w:ascii="Arial" w:hAnsi="Arial"/>
+                <w:rFonts w:ascii="Calibri" w:hAnsi="Calibri"/>
                 <w:b w:val="0"/>
                 <w:sz w:val="20"/>
               </w:rPr>
@@ -3871,7 +3910,7 @@
             </w:pPr>
             <w:r>
               <w:rPr>
-                <w:rFonts w:ascii="Arial" w:hAnsi="Arial"/>
+                <w:rFonts w:ascii="Calibri" w:hAnsi="Calibri"/>
                 <w:b w:val="0"/>
                 <w:sz w:val="20"/>
               </w:rPr>
@@ -3902,7 +3941,7 @@
             </w:pPr>
             <w:r>
               <w:rPr>
-                <w:rFonts w:ascii="Arial" w:hAnsi="Arial"/>
+                <w:rFonts w:ascii="Calibri" w:hAnsi="Calibri"/>
                 <w:b w:val="0"/>
                 <w:sz w:val="20"/>
               </w:rPr>
@@ -3931,14 +3970,15 @@
               <w:bottom w:w="80" w:type="dxa"/>
               <w:right w:w="80" w:type="dxa"/>
             </w:tcMar>
-          </w:tcPr>
-          <w:p>
-            <w:pPr>
-              <w:spacing w:after="40" w:line="252" w:lineRule="auto"/>
-            </w:pPr>
-            <w:r>
-              <w:rPr>
-                <w:rFonts w:ascii="Arial" w:hAnsi="Arial"/>
+            <w:shd w:fill="F5F8FC"/>
+          </w:tcPr>
+          <w:p>
+            <w:pPr>
+              <w:spacing w:after="40" w:line="252" w:lineRule="auto"/>
+            </w:pPr>
+            <w:r>
+              <w:rPr>
+                <w:rFonts w:ascii="Calibri" w:hAnsi="Calibri"/>
                 <w:b w:val="0"/>
                 <w:sz w:val="20"/>
               </w:rPr>
@@ -3962,14 +4002,15 @@
               <w:bottom w:w="80" w:type="dxa"/>
               <w:right w:w="80" w:type="dxa"/>
             </w:tcMar>
-          </w:tcPr>
-          <w:p>
-            <w:pPr>
-              <w:spacing w:after="40" w:line="252" w:lineRule="auto"/>
-            </w:pPr>
-            <w:r>
-              <w:rPr>
-                <w:rFonts w:ascii="Arial" w:hAnsi="Arial"/>
+            <w:shd w:fill="F5F8FC"/>
+          </w:tcPr>
+          <w:p>
+            <w:pPr>
+              <w:spacing w:after="40" w:line="252" w:lineRule="auto"/>
+            </w:pPr>
+            <w:r>
+              <w:rPr>
+                <w:rFonts w:ascii="Calibri" w:hAnsi="Calibri"/>
                 <w:b w:val="0"/>
                 <w:sz w:val="20"/>
               </w:rPr>
@@ -3993,14 +4034,15 @@
               <w:bottom w:w="80" w:type="dxa"/>
               <w:right w:w="80" w:type="dxa"/>
             </w:tcMar>
-          </w:tcPr>
-          <w:p>
-            <w:pPr>
-              <w:spacing w:after="40" w:line="252" w:lineRule="auto"/>
-            </w:pPr>
-            <w:r>
-              <w:rPr>
-                <w:rFonts w:ascii="Arial" w:hAnsi="Arial"/>
+            <w:shd w:fill="F5F8FC"/>
+          </w:tcPr>
+          <w:p>
+            <w:pPr>
+              <w:spacing w:after="40" w:line="252" w:lineRule="auto"/>
+            </w:pPr>
+            <w:r>
+              <w:rPr>
+                <w:rFonts w:ascii="Calibri" w:hAnsi="Calibri"/>
                 <w:b w:val="0"/>
                 <w:sz w:val="20"/>
               </w:rPr>
@@ -4036,7 +4078,7 @@
             </w:pPr>
             <w:r>
               <w:rPr>
-                <w:rFonts w:ascii="Arial" w:hAnsi="Arial"/>
+                <w:rFonts w:ascii="Calibri" w:hAnsi="Calibri"/>
                 <w:b w:val="0"/>
                 <w:sz w:val="20"/>
               </w:rPr>
@@ -4067,7 +4109,7 @@
             </w:pPr>
             <w:r>
               <w:rPr>
-                <w:rFonts w:ascii="Arial" w:hAnsi="Arial"/>
+                <w:rFonts w:ascii="Calibri" w:hAnsi="Calibri"/>
                 <w:b w:val="0"/>
                 <w:sz w:val="20"/>
               </w:rPr>
@@ -4098,7 +4140,7 @@
             </w:pPr>
             <w:r>
               <w:rPr>
-                <w:rFonts w:ascii="Arial" w:hAnsi="Arial"/>
+                <w:rFonts w:ascii="Calibri" w:hAnsi="Calibri"/>
                 <w:b w:val="0"/>
                 <w:sz w:val="20"/>
               </w:rPr>
@@ -4127,14 +4169,15 @@
               <w:bottom w:w="80" w:type="dxa"/>
               <w:right w:w="80" w:type="dxa"/>
             </w:tcMar>
-          </w:tcPr>
-          <w:p>
-            <w:pPr>
-              <w:spacing w:after="40" w:line="252" w:lineRule="auto"/>
-            </w:pPr>
-            <w:r>
-              <w:rPr>
-                <w:rFonts w:ascii="Arial" w:hAnsi="Arial"/>
+            <w:shd w:fill="F5F8FC"/>
+          </w:tcPr>
+          <w:p>
+            <w:pPr>
+              <w:spacing w:after="40" w:line="252" w:lineRule="auto"/>
+            </w:pPr>
+            <w:r>
+              <w:rPr>
+                <w:rFonts w:ascii="Calibri" w:hAnsi="Calibri"/>
                 <w:b w:val="0"/>
                 <w:sz w:val="20"/>
               </w:rPr>
@@ -4158,14 +4201,15 @@
               <w:bottom w:w="80" w:type="dxa"/>
               <w:right w:w="80" w:type="dxa"/>
             </w:tcMar>
-          </w:tcPr>
-          <w:p>
-            <w:pPr>
-              <w:spacing w:after="40" w:line="252" w:lineRule="auto"/>
-            </w:pPr>
-            <w:r>
-              <w:rPr>
-                <w:rFonts w:ascii="Arial" w:hAnsi="Arial"/>
+            <w:shd w:fill="F5F8FC"/>
+          </w:tcPr>
+          <w:p>
+            <w:pPr>
+              <w:spacing w:after="40" w:line="252" w:lineRule="auto"/>
+            </w:pPr>
+            <w:r>
+              <w:rPr>
+                <w:rFonts w:ascii="Calibri" w:hAnsi="Calibri"/>
                 <w:b w:val="0"/>
                 <w:sz w:val="20"/>
               </w:rPr>
@@ -4189,14 +4233,15 @@
               <w:bottom w:w="80" w:type="dxa"/>
               <w:right w:w="80" w:type="dxa"/>
             </w:tcMar>
-          </w:tcPr>
-          <w:p>
-            <w:pPr>
-              <w:spacing w:after="40" w:line="252" w:lineRule="auto"/>
-            </w:pPr>
-            <w:r>
-              <w:rPr>
-                <w:rFonts w:ascii="Arial" w:hAnsi="Arial"/>
+            <w:shd w:fill="F5F8FC"/>
+          </w:tcPr>
+          <w:p>
+            <w:pPr>
+              <w:spacing w:after="40" w:line="252" w:lineRule="auto"/>
+            </w:pPr>
+            <w:r>
+              <w:rPr>
+                <w:rFonts w:ascii="Calibri" w:hAnsi="Calibri"/>
                 <w:b w:val="0"/>
                 <w:sz w:val="20"/>
               </w:rPr>
@@ -4232,7 +4277,7 @@
             </w:pPr>
             <w:r>
               <w:rPr>
-                <w:rFonts w:ascii="Arial" w:hAnsi="Arial"/>
+                <w:rFonts w:ascii="Calibri" w:hAnsi="Calibri"/>
                 <w:b w:val="0"/>
                 <w:sz w:val="20"/>
               </w:rPr>
@@ -4263,7 +4308,7 @@
             </w:pPr>
             <w:r>
               <w:rPr>
-                <w:rFonts w:ascii="Arial" w:hAnsi="Arial"/>
+                <w:rFonts w:ascii="Calibri" w:hAnsi="Calibri"/>
                 <w:b w:val="0"/>
                 <w:sz w:val="20"/>
               </w:rPr>
@@ -4294,7 +4339,7 @@
             </w:pPr>
             <w:r>
               <w:rPr>
-                <w:rFonts w:ascii="Arial" w:hAnsi="Arial"/>
+                <w:rFonts w:ascii="Calibri" w:hAnsi="Calibri"/>
                 <w:b w:val="0"/>
                 <w:sz w:val="20"/>
               </w:rPr>
@@ -4323,14 +4368,15 @@
               <w:bottom w:w="80" w:type="dxa"/>
               <w:right w:w="80" w:type="dxa"/>
             </w:tcMar>
-          </w:tcPr>
-          <w:p>
-            <w:pPr>
-              <w:spacing w:after="40" w:line="252" w:lineRule="auto"/>
-            </w:pPr>
-            <w:r>
-              <w:rPr>
-                <w:rFonts w:ascii="Arial" w:hAnsi="Arial"/>
+            <w:shd w:fill="F5F8FC"/>
+          </w:tcPr>
+          <w:p>
+            <w:pPr>
+              <w:spacing w:after="40" w:line="252" w:lineRule="auto"/>
+            </w:pPr>
+            <w:r>
+              <w:rPr>
+                <w:rFonts w:ascii="Calibri" w:hAnsi="Calibri"/>
                 <w:b w:val="0"/>
                 <w:sz w:val="20"/>
               </w:rPr>
@@ -4354,14 +4400,15 @@
               <w:bottom w:w="80" w:type="dxa"/>
               <w:right w:w="80" w:type="dxa"/>
             </w:tcMar>
-          </w:tcPr>
-          <w:p>
-            <w:pPr>
-              <w:spacing w:after="40" w:line="252" w:lineRule="auto"/>
-            </w:pPr>
-            <w:r>
-              <w:rPr>
-                <w:rFonts w:ascii="Arial" w:hAnsi="Arial"/>
+            <w:shd w:fill="F5F8FC"/>
+          </w:tcPr>
+          <w:p>
+            <w:pPr>
+              <w:spacing w:after="40" w:line="252" w:lineRule="auto"/>
+            </w:pPr>
+            <w:r>
+              <w:rPr>
+                <w:rFonts w:ascii="Calibri" w:hAnsi="Calibri"/>
                 <w:b w:val="0"/>
                 <w:sz w:val="20"/>
               </w:rPr>
@@ -4385,14 +4432,15 @@
               <w:bottom w:w="80" w:type="dxa"/>
               <w:right w:w="80" w:type="dxa"/>
             </w:tcMar>
-          </w:tcPr>
-          <w:p>
-            <w:pPr>
-              <w:spacing w:after="40" w:line="252" w:lineRule="auto"/>
-            </w:pPr>
-            <w:r>
-              <w:rPr>
-                <w:rFonts w:ascii="Arial" w:hAnsi="Arial"/>
+            <w:shd w:fill="F5F8FC"/>
+          </w:tcPr>
+          <w:p>
+            <w:pPr>
+              <w:spacing w:after="40" w:line="252" w:lineRule="auto"/>
+            </w:pPr>
+            <w:r>
+              <w:rPr>
+                <w:rFonts w:ascii="Calibri" w:hAnsi="Calibri"/>
                 <w:b w:val="0"/>
                 <w:sz w:val="20"/>
               </w:rPr>
@@ -4410,7 +4458,7 @@
       </w:pPr>
       <w:r>
         <w:rPr>
-          <w:rFonts w:ascii="Arial" w:hAnsi="Arial"/>
+          <w:rFonts w:ascii="Calibri" w:hAnsi="Calibri"/>
           <w:b w:val="0"/>
           <w:color w:val="000000"/>
           <w:sz w:val="24"/>
@@ -4429,10 +4477,10 @@
       </w:pPr>
       <w:r>
         <w:rPr>
-          <w:rFonts w:ascii="Arial" w:hAnsi="Arial"/>
+          <w:rFonts w:ascii="Calibri" w:hAnsi="Calibri"/>
           <w:b/>
-          <w:color w:val="000000"/>
-          <w:sz w:val="24"/>
+          <w:color w:val="20334D"/>
+          <w:sz w:val="26"/>
         </w:rPr>
         <w:t>Task 3  Alternative fixes and verification</w:t>
       </w:r>
@@ -4448,10 +4496,10 @@
       </w:pPr>
       <w:r>
         <w:rPr>
-          <w:rFonts w:ascii="Arial" w:hAnsi="Arial"/>
+          <w:rFonts w:ascii="Calibri" w:hAnsi="Calibri"/>
           <w:b/>
-          <w:color w:val="000000"/>
-          <w:sz w:val="24"/>
+          <w:color w:val="20334D"/>
+          <w:sz w:val="26"/>
         </w:rPr>
         <w:t>Alternative for line 3</w:t>
       </w:r>
@@ -4464,7 +4512,7 @@
       </w:pPr>
       <w:r>
         <w:rPr>
-          <w:rFonts w:ascii="Arial" w:hAnsi="Arial"/>
+          <w:rFonts w:ascii="Calibri" w:hAnsi="Calibri"/>
           <w:b w:val="0"/>
           <w:color w:val="000000"/>
           <w:sz w:val="24"/>
@@ -4483,10 +4531,10 @@
       </w:pPr>
       <w:r>
         <w:rPr>
-          <w:rFonts w:ascii="Arial" w:hAnsi="Arial"/>
+          <w:rFonts w:ascii="Calibri" w:hAnsi="Calibri"/>
           <w:b/>
-          <w:color w:val="000000"/>
-          <w:sz w:val="24"/>
+          <w:color w:val="20334D"/>
+          <w:sz w:val="26"/>
         </w:rPr>
         <w:t>Alternative for line 20</w:t>
       </w:r>
@@ -4499,7 +4547,7 @@
       </w:pPr>
       <w:r>
         <w:rPr>
-          <w:rFonts w:ascii="Arial" w:hAnsi="Arial"/>
+          <w:rFonts w:ascii="Calibri" w:hAnsi="Calibri"/>
           <w:b w:val="0"/>
           <w:color w:val="000000"/>
           <w:sz w:val="24"/>
@@ -4518,10 +4566,10 @@
       </w:pPr>
       <w:r>
         <w:rPr>
-          <w:rFonts w:ascii="Arial" w:hAnsi="Arial"/>
+          <w:rFonts w:ascii="Calibri" w:hAnsi="Calibri"/>
           <w:b/>
-          <w:color w:val="000000"/>
-          <w:sz w:val="24"/>
+          <w:color w:val="20334D"/>
+          <w:sz w:val="26"/>
         </w:rPr>
         <w:t>Verification</w:t>
       </w:r>
@@ -4534,7 +4582,7 @@
       </w:pPr>
       <w:r>
         <w:rPr>
-          <w:rFonts w:ascii="Arial" w:hAnsi="Arial"/>
+          <w:rFonts w:ascii="Calibri" w:hAnsi="Calibri"/>
           <w:b w:val="0"/>
           <w:color w:val="000000"/>
           <w:sz w:val="24"/>
@@ -4550,7 +4598,7 @@
       </w:pPr>
       <w:r>
         <w:rPr>
-          <w:rFonts w:ascii="Arial" w:hAnsi="Arial"/>
+          <w:rFonts w:ascii="Calibri" w:hAnsi="Calibri"/>
           <w:b w:val="0"/>
           <w:color w:val="000000"/>
           <w:sz w:val="24"/>
@@ -4569,10 +4617,10 @@
       </w:pPr>
       <w:r>
         <w:rPr>
-          <w:rFonts w:ascii="Arial" w:hAnsi="Arial"/>
+          <w:rFonts w:ascii="Calibri" w:hAnsi="Calibri"/>
           <w:b/>
-          <w:color w:val="000000"/>
-          <w:sz w:val="24"/>
+          <w:color w:val="20334D"/>
+          <w:sz w:val="26"/>
         </w:rPr>
         <w:t>Conclusion</w:t>
       </w:r>
@@ -4585,7 +4633,7 @@
       </w:pPr>
       <w:r>
         <w:rPr>
-          <w:rFonts w:ascii="Arial" w:hAnsi="Arial"/>
+          <w:rFonts w:ascii="Calibri" w:hAnsi="Calibri"/>
           <w:b w:val="0"/>
           <w:color w:val="000000"/>
           <w:sz w:val="24"/>
@@ -4604,10 +4652,10 @@
       </w:pPr>
       <w:r>
         <w:rPr>
-          <w:rFonts w:ascii="Arial" w:hAnsi="Arial"/>
+          <w:rFonts w:ascii="Calibri" w:hAnsi="Calibri"/>
           <w:b/>
-          <w:color w:val="000000"/>
-          <w:sz w:val="24"/>
+          <w:color w:val="20334D"/>
+          <w:sz w:val="26"/>
         </w:rPr>
         <w:t>Project files</w:t>
       </w:r>
@@ -4620,7 +4668,7 @@
       </w:pPr>
       <w:r>
         <w:rPr>
-          <w:rFonts w:ascii="Arial" w:hAnsi="Arial"/>
+          <w:rFonts w:ascii="Calibri" w:hAnsi="Calibri"/>
           <w:b w:val="0"/>
           <w:color w:val="000000"/>
           <w:sz w:val="24"/>
@@ -4639,10 +4687,10 @@
       </w:pPr>
       <w:r>
         <w:rPr>
-          <w:rFonts w:ascii="Arial" w:hAnsi="Arial"/>
+          <w:rFonts w:ascii="Calibri" w:hAnsi="Calibri"/>
           <w:b/>
-          <w:color w:val="000000"/>
-          <w:sz w:val="24"/>
+          <w:color w:val="20334D"/>
+          <w:sz w:val="26"/>
         </w:rPr>
         <w:t>References</w:t>
       </w:r>
@@ -4655,7 +4703,7 @@
       </w:pPr>
       <w:r>
         <w:rPr>
-          <w:rFonts w:ascii="Arial" w:hAnsi="Arial"/>
+          <w:rFonts w:ascii="Calibri" w:hAnsi="Calibri"/>
           <w:b w:val="0"/>
           <w:color w:val="000000"/>
           <w:sz w:val="24"/>
@@ -4673,7 +4721,7 @@
       </w:pPr>
       <w:r>
         <w:rPr>
-          <w:rFonts w:ascii="Arial" w:hAnsi="Arial"/>
+          <w:rFonts w:ascii="Calibri" w:hAnsi="Calibri"/>
           <w:b w:val="0"/>
           <w:color w:val="000000"/>
           <w:sz w:val="24"/>
@@ -4691,7 +4739,7 @@
       </w:pPr>
       <w:r>
         <w:rPr>
-          <w:rFonts w:ascii="Arial" w:hAnsi="Arial"/>
+          <w:rFonts w:ascii="Calibri" w:hAnsi="Calibri"/>
           <w:b w:val="0"/>
           <w:color w:val="000000"/>
           <w:sz w:val="24"/>

</xml_diff>